<commit_message>
fix(docx): tighten deterministic judges
</commit_message>
<xml_diff>
--- a/tasks/docx/officebench-1-19-agreement-terms/solution/Golden/summary.docx
+++ b/tasks/docx/officebench-1-19-agreement-terms/solution/Golden/summary.docx
@@ -7,111 +7,74 @@
         <w:pStyle w:val="Heading1"/>
       </w:pPr>
       <w:r>
-        <w:t>Agreement Terms</w:t>
+        <w:t>Agreement Terms and Parties</w:t>
+      </w:r>
+    </w:p>
+    <w:p>
+      <w:pPr>
+        <w:pStyle w:val="Heading2"/>
+      </w:pPr>
+      <w:r>
+        <w:t>Terms</w:t>
+      </w:r>
+    </w:p>
+    <w:p>
+      <w:pPr>
+        <w:pStyle w:val="ListBullet"/>
+      </w:pPr>
+      <w:r>
+        <w:t>The service provider will offer the described services to the client for the specified period.</w:t>
+      </w:r>
+    </w:p>
+    <w:p>
+      <w:pPr>
+        <w:pStyle w:val="ListBullet"/>
+      </w:pPr>
+      <w:r>
+        <w:t>Payment will be made according to the agreed schedule.</w:t>
+      </w:r>
+    </w:p>
+    <w:p>
+      <w:pPr>
+        <w:pStyle w:val="ListBullet"/>
+      </w:pPr>
+      <w:r>
+        <w:t>Confidentiality of information will be maintained by both parties.</w:t>
+      </w:r>
+    </w:p>
+    <w:p>
+      <w:pPr>
+        <w:pStyle w:val="ListBullet"/>
+      </w:pPr>
+      <w:r>
+        <w:t>Termination of the agreement can be done by either party with a notice period of 30 days.</w:t>
+      </w:r>
+    </w:p>
+    <w:p>
+      <w:pPr>
+        <w:pStyle w:val="Heading2"/>
+      </w:pPr>
+      <w:r>
+        <w:t>Parties Involved</w:t>
       </w:r>
     </w:p>
     <w:p>
       <w:r>
-        <w:t xml:space="preserve">                                         Contract Agreement</w:t>
-        <w:br/>
-        <w:br/>
-        <w:t>Terms and Conditions</w:t>
-        <w:br/>
-        <w:br/>
-        <w:br/>
-        <w:br/>
-        <w:t>1. Introduction</w:t>
-        <w:br/>
-        <w:br/>
-        <w:t>This Contract Agreement (hereafter referred to as 'Agreement') is entered into by and between the</w:t>
-        <w:br/>
-        <w:br/>
-        <w:t>following parties:</w:t>
-        <w:br/>
-        <w:br/>
-        <w:br/>
-        <w:br/>
-        <w:t>2. Terms</w:t>
-        <w:br/>
-        <w:br/>
-        <w:t>The parties agree to the following terms and conditions:</w:t>
-        <w:br/>
-        <w:br/>
-        <w:t>- The service provider will offer the described services to the client for the specified period.</w:t>
-        <w:br/>
-        <w:br/>
-        <w:t>- Payment will be made according to the agreed schedule.</w:t>
-        <w:br/>
-        <w:br/>
-        <w:t>- Confidentiality of information will be maintained by both parties.</w:t>
-        <w:br/>
-        <w:br/>
-        <w:t>- Termination of the agreement can be done by either party with a notice period of 30 days.</w:t>
-        <w:br/>
-        <w:br/>
-        <w:br/>
-        <w:br/>
-        <w:t>Parties Involved</w:t>
-        <w:br/>
-        <w:br/>
-        <w:br/>
-        <w:br/>
         <w:t>Party 1: ABC Company</w:t>
         <w:br/>
-        <w:br/>
         <w:t>Role: Service Provider</w:t>
-        <w:br/>
-        <w:br/>
-        <w:br/>
-        <w:br/>
+      </w:r>
+    </w:p>
+    <w:p>
+      <w:r>
         <w:t>Party 2: XYZ Inc.</w:t>
         <w:br/>
-        <w:br/>
         <w:t>Role: Client</w:t>
-        <w:br/>
-        <w:br/>
-        <w:br/>
-        <w:br/>
-        <w:t>Dates and Signatures</w:t>
-        <w:br/>
-        <w:br/>
-        <w:br/>
-        <w:br/>
+      </w:r>
+    </w:p>
+    <w:p>
+      <w:r>
         <w:t>Effective Date: 2024-05-29</w:t>
-        <w:br/>
-        <w:br/>
-        <w:br/>
-        <w:br/>
-        <w:br/>
-        <w:t xml:space="preserve">                                                  Page 1</w:t>
-        <w:br/>
-        <w:t xml:space="preserve">                          Contract Agreement</w:t>
-        <w:br/>
-        <w:br/>
-        <w:t>Signatures:</w:t>
-        <w:br/>
-        <w:br/>
-        <w:br/>
-        <w:br/>
-        <w:t>_______________________</w:t>
-        <w:br/>
-        <w:br/>
-        <w:t>ABC Company</w:t>
-        <w:br/>
-        <w:br/>
-        <w:br/>
-        <w:br/>
-        <w:t>_______________________</w:t>
-        <w:br/>
-        <w:br/>
-        <w:t>XYZ Inc.</w:t>
-        <w:br/>
-        <w:br/>
-        <w:br/>
-        <w:br/>
-        <w:br/>
-        <w:t xml:space="preserve">                                 Page 2</w:t>
-        <w:br/>
       </w:r>
     </w:p>
     <w:sectPr>

</xml_diff>